<commit_message>
feat(biota): reconstruccion de tags de 74-01 (~40 placeholders sin etiquetar), Tabla 5 con bucle por punto, parrafo de acreditacion reescrito para comunidades bioticas y config propia
- Se conservan los 3 escenarios (hidrobiologico/flora/fauna).
- El parrafo de acreditacion venia copiado de Calidad de Aire (gases/biogas).
- Nuevo test tests/templatePlaceholders.test.ts (Suelos y Biota): falla si vuelven placeholders XX/xx/DD-MM-AAAA, instrucciones editoriales o tags sin config.
- Copia previa en templates/reports/_backups_2026-09-23/. Pendiente: linea OT del encabezado.

Co-Authored-By: Claude Sonnet 5 <noreply@anthropic.com>
</commit_message>
<xml_diff>
--- a/server/templates/reports/FO-PO-PSM-74-01 FORMATO PARA ELABORACIÓN DE INFORMES DE BIOTA-plantilla.docx
+++ b/server/templates/reports/FO-PO-PSM-74-01 FORMATO PARA ELABORACIÓN DE INFORMES DE BIOTA-plantilla.docx
@@ -346,7 +346,7 @@
           <w:szCs w:val="28"/>
           <w:lang w:val="es-CO"/>
         </w:rPr>
-        <w:t>xx</w:t>
+        <w:t>{fecha_muestreo}</w:t>
       </w:r>
       <w:proofErr w:type="spellEnd"/>
       <w:r>
@@ -359,7 +359,7 @@
           <w:szCs w:val="28"/>
           <w:lang w:val="es-CO"/>
         </w:rPr>
-        <w:t xml:space="preserve"> de mes de año.</w:t>
+        <w:t xml:space="preserve">.</w:t>
       </w:r>
       <w:r>
         <w:rPr>
@@ -559,12 +559,13 @@
         <w:rPr>
           <w:rFonts w:ascii="Avenir Next LT Pro" w:eastAsia="Times New Roman" w:hAnsi="Avenir Next LT Pro" w:cs="Calibri"/>
           <w:b/>
+          <w:caps/>
           <w:color w:val="303030"/>
           <w:sz w:val="22"/>
           <w:szCs w:val="20"/>
           <w:lang w:val="es-CO"/>
         </w:rPr>
-        <w:t xml:space="preserve">{monitoreo_ciudad} </w:t>
+        <w:t xml:space="preserve">{monitoreo_ciudad}</w:t>
       </w:r>
       <w:r>
         <w:rPr>
@@ -583,7 +584,7 @@
           <w:szCs w:val="20"/>
           <w:lang w:val="es-CO"/>
         </w:rPr>
-        <w:t>(</w:t>
+        <w:t/>
       </w:r>
       <w:r>
         <w:rPr>
@@ -594,7 +595,7 @@
           <w:szCs w:val="20"/>
           <w:lang w:val="es-CO"/>
         </w:rPr>
-        <w:t>EN MAYUSCULA)</w:t>
+        <w:t/>
       </w:r>
       <w:r>
         <w:rPr>
@@ -6142,7 +6143,7 @@
         <w:rPr>
           <w:lang w:val="es-CO"/>
         </w:rPr>
-        <w:t>Fotografía 1. Toma de muestra en XX</w:t>
+        <w:t>Fotografía 1. Toma de muestra en {foto1_sitio}</w:t>
       </w:r>
       <w:r>
         <w:tab/>
@@ -6179,7 +6180,7 @@
         <w:rPr>
           <w:lang w:val="es-CO"/>
         </w:rPr>
-        <w:t>Fotografía 2. Toma de muestra en XXX</w:t>
+        <w:t>Fotografía 2. Toma de muestra en {foto2_sitio}</w:t>
       </w:r>
       <w:r>
         <w:tab/>
@@ -6699,7 +6700,7 @@
           <w:szCs w:val="22"/>
           <w:lang w:val="es-CO"/>
         </w:rPr>
-        <w:t>No. (se encuentra en la OIT)</w:t>
+        <w:t>No. {contrato_numero}</w:t>
       </w:r>
       <w:r>
         <w:rPr>
@@ -6730,7 +6731,7 @@
           <w:szCs w:val="22"/>
           <w:lang w:val="es-CO"/>
         </w:rPr>
-        <w:t>xxxxxxxx</w:t>
+        <w:t>{tipo_estudio_texto}</w:t>
       </w:r>
       <w:proofErr w:type="spellEnd"/>
       <w:r>
@@ -6762,7 +6763,7 @@
           <w:szCs w:val="22"/>
           <w:lang w:val="es-CO"/>
         </w:rPr>
-        <w:t>xxxxxxx</w:t>
+        <w:t>{comunidades_evaluadas}</w:t>
       </w:r>
       <w:proofErr w:type="spellEnd"/>
       <w:r>
@@ -6782,7 +6783,7 @@
           <w:szCs w:val="22"/>
           <w:lang w:val="es-CO"/>
         </w:rPr>
-        <w:t xml:space="preserve">, </w:t>
+        <w:t xml:space="preserve"/>
       </w:r>
       <w:proofErr w:type="spellStart"/>
       <w:r>
@@ -6793,7 +6794,7 @@
           <w:szCs w:val="22"/>
           <w:lang w:val="es-CO"/>
         </w:rPr>
-        <w:t>xxxxxxx</w:t>
+        <w:t/>
       </w:r>
       <w:proofErr w:type="spellEnd"/>
       <w:r>
@@ -6804,7 +6805,7 @@
           <w:szCs w:val="22"/>
           <w:lang w:val="es-CO"/>
         </w:rPr>
-        <w:t xml:space="preserve"> y </w:t>
+        <w:t xml:space="preserve"/>
       </w:r>
       <w:proofErr w:type="spellStart"/>
       <w:r>
@@ -6815,7 +6816,7 @@
           <w:szCs w:val="22"/>
           <w:lang w:val="es-CO"/>
         </w:rPr>
-        <w:t>xxxxxx</w:t>
+        <w:t/>
       </w:r>
       <w:proofErr w:type="spellEnd"/>
       <w:r>
@@ -6837,7 +6838,7 @@
           <w:szCs w:val="22"/>
           <w:lang w:val="es-CO"/>
         </w:rPr>
-        <w:t>xxxxxxxxx</w:t>
+        <w:t>{punto_nombre}</w:t>
       </w:r>
       <w:proofErr w:type="spellEnd"/>
       <w:r>
@@ -6892,7 +6893,7 @@
           <w:szCs w:val="22"/>
           <w:lang w:val="es-CO"/>
         </w:rPr>
-        <w:t>xxxxxxxx</w:t>
+        <w:t>en {monitoreo_ciudad}, {monitoreo_departamento}</w:t>
       </w:r>
       <w:proofErr w:type="spellEnd"/>
       <w:r>
@@ -6914,7 +6915,7 @@
           <w:szCs w:val="22"/>
           <w:lang w:val="es-CO"/>
         </w:rPr>
-        <w:t>xxxxxxxxxxx</w:t>
+        <w:t>{metodos_medicion_texto}</w:t>
       </w:r>
       <w:proofErr w:type="spellEnd"/>
       <w:r>
@@ -6958,7 +6959,7 @@
           <w:szCs w:val="22"/>
           <w:lang w:val="es-CO"/>
         </w:rPr>
-        <w:t>xxxx</w:t>
+        <w:t>{fecha_muestreo}</w:t>
       </w:r>
       <w:proofErr w:type="spellEnd"/>
       <w:r>
@@ -6969,7 +6970,7 @@
           <w:szCs w:val="22"/>
           <w:lang w:val="es-CO"/>
         </w:rPr>
-        <w:t xml:space="preserve"> de mes de año</w:t>
+        <w:t xml:space="preserve"/>
       </w:r>
       <w:r>
         <w:rPr>
@@ -6990,7 +6991,7 @@
           <w:szCs w:val="22"/>
           <w:lang w:val="es-CO"/>
         </w:rPr>
-        <w:t>xxxxxxx</w:t>
+        <w:t>{parametros_acreditados}</w:t>
       </w:r>
       <w:proofErr w:type="spellEnd"/>
       <w:r>
@@ -7034,7 +7035,7 @@
           <w:szCs w:val="22"/>
           <w:lang w:val="es-CO"/>
         </w:rPr>
-        <w:t>xxxxxxxxxxx</w:t>
+        <w:t>{parametros_evaluados}</w:t>
       </w:r>
       <w:proofErr w:type="spellEnd"/>
       <w:r>
@@ -7137,7 +7138,7 @@
           <w:sz w:val="22"/>
           <w:szCs w:val="22"/>
         </w:rPr>
-        <w:t>No. (se encuentra en la OIT)</w:t>
+        <w:t>No. {contrato_numero}</w:t>
       </w:r>
       <w:r>
         <w:rPr>
@@ -7408,7 +7409,7 @@
           <w:szCs w:val="22"/>
           <w:lang w:val="es-CO"/>
         </w:rPr>
-        <w:t>de XX</w:t>
+        <w:t>de {numero_parcelas_transectos}</w:t>
       </w:r>
       <w:r>
         <w:rPr>
@@ -7428,7 +7429,7 @@
           <w:szCs w:val="22"/>
           <w:lang w:val="es-CO"/>
         </w:rPr>
-        <w:t>XXXX</w:t>
+        <w:t>{area_flora}</w:t>
       </w:r>
       <w:r>
         <w:rPr>
@@ -7448,7 +7449,7 @@
           <w:szCs w:val="22"/>
           <w:lang w:val="es-CO"/>
         </w:rPr>
-        <w:t>XXXX, XXX (municipio), XXX (departamento)</w:t>
+        <w:t>{monitoreo_ciudad}, {monitoreo_departamento}</w:t>
       </w:r>
       <w:r>
         <w:rPr>
@@ -7629,7 +7630,7 @@
           <w:sz w:val="22"/>
           <w:szCs w:val="22"/>
         </w:rPr>
-        <w:t>No. (se encuentra en la OIT),</w:t>
+        <w:t>No. {contrato_numero},</w:t>
       </w:r>
       <w:r>
         <w:rPr>
@@ -7872,7 +7873,7 @@
           <w:szCs w:val="22"/>
           <w:lang w:val="es-CO"/>
         </w:rPr>
-        <w:t>XXXX</w:t>
+        <w:t>{area_fauna}</w:t>
       </w:r>
       <w:r>
         <w:rPr>
@@ -7892,7 +7893,7 @@
           <w:szCs w:val="22"/>
           <w:lang w:val="es-CO"/>
         </w:rPr>
-        <w:t>XXXX, XXX (municipio), XXX (departamento)</w:t>
+        <w:t>{monitoreo_ciudad}, {monitoreo_departamento}</w:t>
       </w:r>
       <w:r>
         <w:rPr>
@@ -10213,7 +10214,7 @@
           <w:color w:val="303030"/>
           <w:lang w:eastAsia="es-CO"/>
         </w:rPr>
-        <w:t xml:space="preserve"> para la ejecución de mediciones de composición de gases el </w:t>
+        <w:t xml:space="preserve"> para la caracterización de comunidades bióticas realizada el </w:t>
       </w:r>
       <w:r>
         <w:rPr>
@@ -10221,7 +10222,7 @@
           <w:color w:val="303030"/>
           <w:lang w:eastAsia="es-CO"/>
         </w:rPr>
-        <w:t>día X de XXX de 202X</w:t>
+        <w:t>día {fecha_muestreo}</w:t>
       </w:r>
       <w:r>
         <w:rPr>
@@ -10237,7 +10238,7 @@
           <w:color w:val="303030"/>
           <w:lang w:eastAsia="es-CO"/>
         </w:rPr>
-        <w:t>la Resolución XXX</w:t>
+        <w:t>la Resolución {numero_resolucion_ideam}</w:t>
       </w:r>
       <w:r>
         <w:rPr>
@@ -10252,7 +10253,7 @@
           <w:color w:val="303030"/>
           <w:lang w:eastAsia="es-CO"/>
         </w:rPr>
-        <w:t>vigente hasta el XX de XXX de 202X,</w:t>
+        <w:t>vigente hasta el {vigencia_resolucion_ideam},</w:t>
       </w:r>
       <w:r>
         <w:rPr>
@@ -10284,7 +10285,7 @@
           <w:color w:val="303030"/>
           <w:lang w:eastAsia="es-CO"/>
         </w:rPr>
-        <w:t>Cabe resaltar que las mediciones de biogás no se encuentran dentro del alcance de la acreditación.</w:t>
+        <w:t/>
       </w:r>
       <w:r>
         <w:rPr>
@@ -12298,7 +12299,7 @@
           <w:sz w:val="20"/>
           <w:lang w:val="es-CO"/>
         </w:rPr>
-        <w:t>XXXX</w:t>
+        <w:t>{fuente_anio}</w:t>
       </w:r>
       <w:r>
         <w:rPr>
@@ -12642,7 +12643,7 @@
                 <w:szCs w:val="20"/>
                 <w:lang w:val="es-CO" w:eastAsia="es-CO"/>
               </w:rPr>
-              <w:t>XXX</w:t>
+              <w:t>{sitio_muestreo}</w:t>
             </w:r>
           </w:p>
         </w:tc>
@@ -12991,7 +12992,7 @@
           <w:szCs w:val="20"/>
           <w:lang w:val="es-CO"/>
         </w:rPr>
-        <w:t>XXXX</w:t>
+        <w:t>{fuente_anio}</w:t>
       </w:r>
       <w:r>
         <w:rPr>
@@ -13131,7 +13132,7 @@
           <w:szCs w:val="22"/>
           <w:lang w:val="es-CO"/>
         </w:rPr>
-        <w:t>XXXXXXXXXXX</w:t>
+        <w:t>{tipo_estudio_texto}</w:t>
       </w:r>
       <w:r>
         <w:rPr>
@@ -13149,7 +13150,7 @@
           <w:szCs w:val="22"/>
           <w:lang w:val="es-CO"/>
         </w:rPr>
-        <w:t xml:space="preserve"> (</w:t>
+        <w:t xml:space="preserve"> </w:t>
       </w:r>
       <w:r>
         <w:rPr>
@@ -13159,7 +13160,7 @@
           <w:szCs w:val="22"/>
           <w:lang w:val="es-CO"/>
         </w:rPr>
-        <w:t>nombrar las comunidades</w:t>
+        <w:t>{comunidades_evaluadas}</w:t>
       </w:r>
       <w:r>
         <w:rPr>
@@ -13169,7 +13170,7 @@
           <w:szCs w:val="22"/>
           <w:lang w:val="es-CO"/>
         </w:rPr>
-        <w:t xml:space="preserve">) en </w:t>
+        <w:t xml:space="preserve"> en </w:t>
       </w:r>
       <w:r>
         <w:rPr>
@@ -13179,7 +13180,7 @@
           <w:szCs w:val="22"/>
           <w:lang w:val="es-CO"/>
         </w:rPr>
-        <w:t>XXX</w:t>
+        <w:t>{sistema_evaluado}</w:t>
       </w:r>
       <w:r>
         <w:rPr>
@@ -13230,7 +13231,7 @@
           <w:szCs w:val="22"/>
           <w:lang w:val="es-CO"/>
         </w:rPr>
-        <w:t>en (</w:t>
+        <w:t xml:space="preserve">en </w:t>
       </w:r>
       <w:r>
         <w:rPr>
@@ -13240,7 +13241,7 @@
           <w:szCs w:val="22"/>
           <w:lang w:val="es-CO"/>
         </w:rPr>
-        <w:t>aquí se citan los métodos de análisis empleados</w:t>
+        <w:t>{metodos_citados}</w:t>
       </w:r>
       <w:r>
         <w:rPr>
@@ -13258,7 +13259,7 @@
           <w:szCs w:val="22"/>
           <w:lang w:val="es-CO"/>
         </w:rPr>
-        <w:t>).</w:t>
+        <w:t>.</w:t>
       </w:r>
       <w:r>
         <w:rPr>
@@ -13289,7 +13290,7 @@
           <w:szCs w:val="22"/>
           <w:lang w:val="es-CO"/>
         </w:rPr>
-        <w:t>xx</w:t>
+        <w:t>{fecha_muestreo}</w:t>
       </w:r>
       <w:proofErr w:type="spellEnd"/>
       <w:r>
@@ -13300,7 +13301,7 @@
           <w:szCs w:val="22"/>
           <w:lang w:val="es-CO"/>
         </w:rPr>
-        <w:t xml:space="preserve"> de mes de año.</w:t>
+        <w:t xml:space="preserve">.</w:t>
       </w:r>
       <w:r>
         <w:rPr>
@@ -13332,7 +13333,7 @@
           <w:szCs w:val="22"/>
           <w:lang w:val="es-CO"/>
         </w:rPr>
-        <w:t xml:space="preserve"> (XXXXX) / ambientales (</w:t>
+        <w:t xml:space="preserve"> ({parametros_insitu}) / ambientales (</w:t>
       </w:r>
       <w:proofErr w:type="spellStart"/>
       <w:r>
@@ -13343,7 +13344,7 @@
           <w:szCs w:val="22"/>
           <w:lang w:val="es-CO"/>
         </w:rPr>
-        <w:t>xxxxxxx</w:t>
+        <w:t>{parametros_ambientales}</w:t>
       </w:r>
       <w:proofErr w:type="spellEnd"/>
       <w:r>
@@ -13407,7 +13408,7 @@
           <w:szCs w:val="22"/>
           <w:lang w:val="es-CO"/>
         </w:rPr>
-        <w:t>, XXXX</w:t>
+        <w:t/>
       </w:r>
       <w:r>
         <w:rPr>
@@ -13583,7 +13584,7 @@
           <w:sz w:val="22"/>
           <w:lang w:val="es-CO"/>
         </w:rPr>
-        <w:t>(</w:t>
+        <w:t/>
       </w:r>
       <w:r>
         <w:rPr>
@@ -13593,7 +13594,7 @@
           <w:sz w:val="22"/>
           <w:lang w:val="es-CO"/>
         </w:rPr>
-        <w:t>XXX</w:t>
+        <w:t>{codigo_formatos_campo}</w:t>
       </w:r>
       <w:r>
         <w:rPr>
@@ -13603,7 +13604,7 @@
           <w:sz w:val="22"/>
           <w:lang w:val="es-CO"/>
         </w:rPr>
-        <w:t>).</w:t>
+        <w:t>.</w:t>
       </w:r>
       <w:r>
         <w:rPr>
@@ -14064,7 +14065,7 @@
               <w:rPr>
                 <w:lang w:val="es-CO"/>
               </w:rPr>
-              <w:t>XX</w:t>
+              <w:t>{foto1_sitio}</w:t>
             </w:r>
             <w:r>
               <w:rPr>
@@ -14135,7 +14136,7 @@
               <w:rPr>
                 <w:lang w:val="es-CO"/>
               </w:rPr>
-              <w:t>. Toma de muestra en XXX</w:t>
+              <w:t>. Toma de muestra en {foto2_sitio}</w:t>
             </w:r>
             <w:bookmarkEnd w:id="158"/>
             <w:bookmarkEnd w:id="159"/>
@@ -14180,7 +14181,7 @@
           <w:szCs w:val="20"/>
           <w:lang w:val="es-CO"/>
         </w:rPr>
-        <w:t>XXXX</w:t>
+        <w:t>{fuente_anio}</w:t>
       </w:r>
       <w:r>
         <w:rPr>
@@ -14429,7 +14430,7 @@
           <w:szCs w:val="22"/>
           <w:lang w:val="es-CO"/>
         </w:rPr>
-        <w:t>municipio XXXX, departamento XXX</w:t>
+        <w:t>municipio {monitoreo_ciudad}, departamento {monitoreo_departamento}</w:t>
       </w:r>
       <w:r>
         <w:rPr>
@@ -14475,25 +14476,25 @@
           <w:sz w:val="22"/>
           <w:szCs w:val="22"/>
         </w:rPr>
-        <w:t xml:space="preserve">Relacionar </w:t>
-      </w:r>
-      <w:r>
-        <w:rPr>
-          <w:rFonts w:ascii="Avenir Next LT Pro" w:hAnsi="Avenir Next LT Pro" w:cs="Calibri"/>
-          <w:color w:val="303030"/>
-          <w:sz w:val="22"/>
-          <w:szCs w:val="22"/>
-        </w:rPr>
-        <w:t>información climática, y aspectos geográficos del área de estudio según lo que se encuentra en la bibliografía actual de la página</w:t>
-      </w:r>
-      <w:r>
-        <w:rPr>
-          <w:rFonts w:ascii="Avenir Next LT Pro" w:hAnsi="Avenir Next LT Pro" w:cs="Calibri"/>
-          <w:color w:val="303030"/>
-          <w:sz w:val="22"/>
-          <w:szCs w:val="22"/>
-        </w:rPr>
-        <w:t xml:space="preserve"> </w:t>
+        <w:t xml:space="preserve">{descripcion_area_estudio}</w:t>
+      </w:r>
+      <w:r>
+        <w:rPr>
+          <w:rFonts w:ascii="Avenir Next LT Pro" w:hAnsi="Avenir Next LT Pro" w:cs="Calibri"/>
+          <w:color w:val="303030"/>
+          <w:sz w:val="22"/>
+          <w:szCs w:val="22"/>
+        </w:rPr>
+        <w:t/>
+      </w:r>
+      <w:r>
+        <w:rPr>
+          <w:rFonts w:ascii="Avenir Next LT Pro" w:hAnsi="Avenir Next LT Pro" w:cs="Calibri"/>
+          <w:color w:val="303030"/>
+          <w:sz w:val="22"/>
+          <w:szCs w:val="22"/>
+        </w:rPr>
+        <w:t xml:space="preserve"/>
       </w:r>
       <w:hyperlink r:id="rId12" w:history="1">
         <w:r>
@@ -14501,7 +14502,7 @@
             <w:rFonts w:ascii="Avenir Next LT Pro" w:hAnsi="Avenir Next LT Pro"/>
             <w:color w:val="303030"/>
           </w:rPr>
-          <w:t>www.es.climate-data.org/</w:t>
+          <w:t/>
         </w:r>
       </w:hyperlink>
       <w:r>
@@ -15062,7 +15063,7 @@
                 <w:szCs w:val="20"/>
                 <w:lang w:val="es-CO" w:eastAsia="es-CO"/>
               </w:rPr>
-              <w:t>Sistema (Lotico o, lentico, marino o estuarino)</w:t>
+              <w:t>{tipo_sistema}</w:t>
             </w:r>
             <w:r>
               <w:rPr>
@@ -15109,7 +15110,7 @@
                 <w:szCs w:val="20"/>
                 <w:lang w:val="es-CO" w:eastAsia="es-CO"/>
               </w:rPr>
-              <w:t>Fecha: día/mes/año</w:t>
+              <w:t>Fecha: {fecha_muestreo}</w:t>
             </w:r>
           </w:p>
         </w:tc>
@@ -15446,7 +15447,7 @@
                 <w:szCs w:val="20"/>
                 <w:lang w:val="es-CO" w:eastAsia="es-CO"/>
               </w:rPr>
-              <w:t>Nombre del punto</w:t>
+              <w:t>{#puntos_monitoreo}{nombre}</w:t>
             </w:r>
           </w:p>
         </w:tc>
@@ -15475,7 +15476,7 @@
                 <w:szCs w:val="20"/>
                 <w:lang w:val="es-CO" w:eastAsia="es-CO"/>
               </w:rPr>
-              <w:t>ID</w:t>
+              <w:t>{codigo}</w:t>
             </w:r>
           </w:p>
         </w:tc>
@@ -15506,7 +15507,7 @@
                 <w:szCs w:val="20"/>
                 <w:lang w:val="es-CO" w:eastAsia="es-CO"/>
               </w:rPr>
-              <w:t>h</w:t>
+              <w:t>{punto_hora}</w:t>
             </w:r>
             <w:r>
               <w:rPr>
@@ -15516,7 +15517,7 @@
                 <w:szCs w:val="20"/>
                 <w:lang w:val="es-CO" w:eastAsia="es-CO"/>
               </w:rPr>
-              <w:t>h:mm</w:t>
+              <w:t/>
             </w:r>
             <w:proofErr w:type="spellEnd"/>
           </w:p>
@@ -15538,6 +15539,9 @@
                 <w:lang w:val="es-CO" w:eastAsia="es-CO"/>
               </w:rPr>
             </w:pPr>
+            <w:r>
+              <w:t>{punto_cota}</w:t>
+            </w:r>
           </w:p>
         </w:tc>
         <w:tc>
@@ -15564,7 +15568,7 @@
                 <w:sz w:val="20"/>
                 <w:szCs w:val="20"/>
               </w:rPr>
-              <w:t>XX°</w:t>
+              <w:t>{punto_latitud_gms}</w:t>
             </w:r>
             <w:proofErr w:type="gramStart"/>
             <w:r>
@@ -15574,7 +15578,7 @@
                 <w:sz w:val="20"/>
                 <w:szCs w:val="20"/>
               </w:rPr>
-              <w:t>X'X,XX</w:t>
+              <w:t/>
             </w:r>
             <w:proofErr w:type="gramEnd"/>
             <w:r>
@@ -15584,7 +15588,7 @@
                 <w:sz w:val="20"/>
                 <w:szCs w:val="20"/>
               </w:rPr>
-              <w:t>"N</w:t>
+              <w:t/>
             </w:r>
             <w:proofErr w:type="spellEnd"/>
           </w:p>
@@ -15613,7 +15617,7 @@
                 <w:szCs w:val="20"/>
                 <w:lang w:eastAsia="es-CO"/>
               </w:rPr>
-              <w:t>XXXX, XX N</w:t>
+              <w:t>{punto_norte_or}</w:t>
             </w:r>
           </w:p>
         </w:tc>
@@ -15718,7 +15722,7 @@
                 <w:sz w:val="20"/>
                 <w:szCs w:val="20"/>
               </w:rPr>
-              <w:t>XX°</w:t>
+              <w:t>{punto_longitud_gms}</w:t>
             </w:r>
             <w:proofErr w:type="gramStart"/>
             <w:r>
@@ -15728,7 +15732,7 @@
                 <w:sz w:val="20"/>
                 <w:szCs w:val="20"/>
               </w:rPr>
-              <w:t>X'X,XX</w:t>
+              <w:t/>
             </w:r>
             <w:proofErr w:type="gramEnd"/>
             <w:r>
@@ -15738,7 +15742,7 @@
                 <w:sz w:val="20"/>
                 <w:szCs w:val="20"/>
               </w:rPr>
-              <w:t>"W</w:t>
+              <w:t/>
             </w:r>
             <w:proofErr w:type="spellEnd"/>
           </w:p>
@@ -15767,7 +15771,7 @@
                 <w:szCs w:val="20"/>
                 <w:lang w:eastAsia="es-CO"/>
               </w:rPr>
-              <w:t>XXXX, XX E</w:t>
+              <w:t>{punto_este_or}{/puntos_monitoreo}</w:t>
             </w:r>
           </w:p>
         </w:tc>
@@ -15810,7 +15814,7 @@
           <w:szCs w:val="20"/>
           <w:lang w:val="es-CO"/>
         </w:rPr>
-        <w:t>XXXX</w:t>
+        <w:t>{fuente_anio}</w:t>
       </w:r>
       <w:r>
         <w:rPr>
@@ -15981,7 +15985,7 @@
           <w:szCs w:val="20"/>
           <w:lang w:val="es-CO"/>
         </w:rPr>
-        <w:t>XXXX</w:t>
+        <w:t>{fuente_anio}</w:t>
       </w:r>
       <w:r>
         <w:rPr>
@@ -16455,7 +16459,7 @@
           <w:sz w:val="22"/>
           <w:szCs w:val="22"/>
         </w:rPr>
-        <w:t>XX</w:t>
+        <w:t>{fecha_inicio_muestreo}</w:t>
       </w:r>
       <w:r>
         <w:rPr>
@@ -16481,7 +16485,7 @@
           <w:sz w:val="22"/>
           <w:szCs w:val="22"/>
         </w:rPr>
-        <w:t>XX</w:t>
+        <w:t>{fecha_fin_muestreo}</w:t>
       </w:r>
       <w:r>
         <w:rPr>
@@ -16773,7 +16777,7 @@
           <w:sz w:val="22"/>
           <w:szCs w:val="22"/>
         </w:rPr>
-        <w:t xml:space="preserve"> X</w:t>
+        <w:t xml:space="preserve"> 8</w:t>
       </w:r>
       <w:r>
         <w:rPr>
@@ -18164,7 +18168,7 @@
           <w:szCs w:val="20"/>
           <w:lang w:val="es-CO"/>
         </w:rPr>
-        <w:t>XXXX</w:t>
+        <w:t>{fuente_anio}</w:t>
       </w:r>
       <w:r>
         <w:rPr>
@@ -20381,7 +20385,7 @@
           <w:szCs w:val="22"/>
           <w:lang w:val="es-CO"/>
         </w:rPr>
-        <w:t xml:space="preserve"> XX </w:t>
+        <w:t xml:space="preserve"> {numero_parcelas_transectos} </w:t>
       </w:r>
       <w:r>
         <w:rPr>
@@ -20533,7 +20537,7 @@
           <w:szCs w:val="22"/>
           <w:lang w:val="es-CO"/>
         </w:rPr>
-        <w:t>XX</w:t>
+        <w:t>{numero_subparcelas_1}</w:t>
       </w:r>
       <w:r>
         <w:rPr>
@@ -20577,7 +20581,7 @@
           <w:szCs w:val="22"/>
           <w:lang w:val="es-CO"/>
         </w:rPr>
-        <w:t>XX</w:t>
+        <w:t>{numero_subparcelas_2}</w:t>
       </w:r>
       <w:r>
         <w:rPr>
@@ -28239,7 +28243,7 @@
           <w:sz w:val="20"/>
           <w:szCs w:val="20"/>
         </w:rPr>
-        <w:t>XXXX</w:t>
+        <w:t>{fuente_anio}</w:t>
       </w:r>
       <w:r>
         <w:rPr>
@@ -38676,7 +38680,7 @@
           <w:szCs w:val="22"/>
           <w:lang w:val="es-CO"/>
         </w:rPr>
-        <w:t>N</w:t>
+        <w:t>{cliente_nombre}</w:t>
       </w:r>
       <w:r>
         <w:rPr>
@@ -38687,7 +38691,7 @@
           <w:szCs w:val="22"/>
           <w:lang w:val="es-CO"/>
         </w:rPr>
-        <w:t>OMBRE EMPRESA.,</w:t>
+        <w:t>,</w:t>
       </w:r>
       <w:r>
         <w:rPr>
@@ -38732,7 +38736,7 @@
           <w:color w:val="303030"/>
           <w:sz w:val="22"/>
         </w:rPr>
-        <w:t>XXX</w:t>
+        <w:t>{comunidades_evaluadas}</w:t>
       </w:r>
       <w:r>
         <w:rPr>
@@ -38759,7 +38763,7 @@
           <w:szCs w:val="22"/>
           <w:lang w:val="es-CO"/>
         </w:rPr>
-        <w:t>en X (X) punto</w:t>
+        <w:t>en {numero_puntos} punto</w:t>
       </w:r>
       <w:r>
         <w:rPr>
@@ -38779,7 +38783,7 @@
           <w:szCs w:val="22"/>
           <w:lang w:val="es-CO"/>
         </w:rPr>
-        <w:t>ubicado en el municipio de XX, departamento de XX.</w:t>
+        <w:t>ubicado en el municipio de {monitoreo_ciudad}, departamento de {monitoreo_departamento}.</w:t>
       </w:r>
       <w:r>
         <w:rPr>
@@ -41178,7 +41182,7 @@
                 <w:szCs w:val="20"/>
                 <w:lang w:eastAsia="es-CO"/>
               </w:rPr>
-              <w:t>OT XXXX-X-</w:t>
+              <w:t>{ot_id}</w:t>
             </w:r>
             <w:r>
               <w:rPr>
@@ -41188,7 +41192,7 @@
                 <w:szCs w:val="20"/>
                 <w:lang w:eastAsia="es-CO"/>
               </w:rPr>
-              <w:t>FF</w:t>
+              <w:t/>
             </w:r>
             <w:r>
               <w:rPr>
@@ -41198,7 +41202,7 @@
                 <w:szCs w:val="20"/>
                 <w:lang w:eastAsia="es-CO"/>
               </w:rPr>
-              <w:t>-XXXX-V</w:t>
+              <w:t/>
             </w:r>
             <w:r>
               <w:rPr>
@@ -41208,7 +41212,7 @@
                 <w:szCs w:val="20"/>
                 <w:lang w:eastAsia="es-CO"/>
               </w:rPr>
-              <w:t>00</w:t>
+              <w:t/>
             </w:r>
           </w:p>
         </w:tc>
@@ -41248,7 +41252,7 @@
                 <w:szCs w:val="20"/>
                 <w:lang w:eastAsia="es-CO"/>
               </w:rPr>
-              <w:t>DD/MM/AAAA</w:t>
+              <w:t>{fecha_ot}</w:t>
             </w:r>
           </w:p>
         </w:tc>
@@ -41901,7 +41905,7 @@
                 <w:szCs w:val="20"/>
                 <w:lang w:eastAsia="es-CO"/>
               </w:rPr>
-              <w:t>OT XXXX-X-</w:t>
+              <w:t>{ot_id_revision}</w:t>
             </w:r>
             <w:r>
               <w:rPr>
@@ -41911,7 +41915,7 @@
                 <w:szCs w:val="20"/>
                 <w:lang w:eastAsia="es-CO"/>
               </w:rPr>
-              <w:t>FF</w:t>
+              <w:t/>
             </w:r>
             <w:r>
               <w:rPr>
@@ -41921,7 +41925,7 @@
                 <w:szCs w:val="20"/>
                 <w:lang w:eastAsia="es-CO"/>
               </w:rPr>
-              <w:t>-XXXX-V</w:t>
+              <w:t/>
             </w:r>
             <w:r>
               <w:rPr>
@@ -41931,7 +41935,7 @@
                 <w:szCs w:val="20"/>
                 <w:lang w:eastAsia="es-CO"/>
               </w:rPr>
-              <w:t>01</w:t>
+              <w:t/>
             </w:r>
           </w:p>
         </w:tc>
@@ -41971,7 +41975,7 @@
                 <w:szCs w:val="20"/>
                 <w:lang w:eastAsia="es-CO"/>
               </w:rPr>
-              <w:t>DD/MM/AAAA</w:t>
+              <w:t>{fecha_revision}</w:t>
             </w:r>
           </w:p>
         </w:tc>
@@ -42320,7 +42324,7 @@
           <w:sz w:val="20"/>
           <w:szCs w:val="20"/>
         </w:rPr>
-        <w:t>XXXX</w:t>
+        <w:t>{fuente_anio}</w:t>
       </w:r>
       <w:r>
         <w:rPr>
@@ -42507,7 +42511,7 @@
           <w:sz w:val="20"/>
           <w:szCs w:val="20"/>
         </w:rPr>
-        <w:t xml:space="preserve">informe técnico de MATRIZ </w:t>
+        <w:t xml:space="preserve">informe técnico de MATRIZ BIOTA </w:t>
       </w:r>
       <w:proofErr w:type="gramStart"/>
       <w:r>
@@ -42518,7 +42522,7 @@
           <w:sz w:val="20"/>
           <w:szCs w:val="20"/>
         </w:rPr>
-        <w:t>XXX  OT</w:t>
+        <w:t>OT {ot_id_final}</w:t>
       </w:r>
       <w:proofErr w:type="gramEnd"/>
       <w:r>
@@ -42529,7 +42533,7 @@
           <w:sz w:val="20"/>
           <w:szCs w:val="20"/>
         </w:rPr>
-        <w:t xml:space="preserve"> XXXX-X-</w:t>
+        <w:t xml:space="preserve"/>
       </w:r>
       <w:r>
         <w:rPr>
@@ -42539,7 +42543,7 @@
           <w:sz w:val="20"/>
           <w:szCs w:val="20"/>
         </w:rPr>
-        <w:t>B</w:t>
+        <w:t/>
       </w:r>
       <w:r>
         <w:rPr>
@@ -42549,7 +42553,7 @@
           <w:sz w:val="20"/>
           <w:szCs w:val="20"/>
         </w:rPr>
-        <w:t>-XXXX-VXX</w:t>
+        <w:t/>
       </w:r>
       <w:r>
         <w:rPr>
@@ -42595,7 +42599,7 @@
           <w:sz w:val="20"/>
           <w:szCs w:val="20"/>
         </w:rPr>
-        <w:t xml:space="preserve"> OT XXXX-X-</w:t>
+        <w:t xml:space="preserve"> OT {ot_id_final}</w:t>
       </w:r>
       <w:r>
         <w:rPr>
@@ -42605,7 +42609,7 @@
           <w:sz w:val="20"/>
           <w:szCs w:val="20"/>
         </w:rPr>
-        <w:t>B</w:t>
+        <w:t/>
       </w:r>
       <w:r>
         <w:rPr>
@@ -42615,7 +42619,7 @@
           <w:sz w:val="20"/>
           <w:szCs w:val="20"/>
         </w:rPr>
-        <w:t>-XXXX-VXX</w:t>
+        <w:t/>
       </w:r>
     </w:p>
     <w:p>

</xml_diff>